<commit_message>
206 last fixing for proyect (#207)
closes: #206
* Fixing details

* Last commit
</commit_message>
<xml_diff>
--- a/test/AppForSEII2526.UIT/UC_BanReport/Test case specification ban user.docx
+++ b/test/AppForSEII2526.UIT/UC_BanReport/Test case specification ban user.docx
@@ -40,7 +40,13 @@
         <w:rPr>
           <w:lang w:val="es-ES"/>
         </w:rPr>
-        <w:t xml:space="preserve">Purchase Products </w:t>
+        <w:t>Ban User</w:t>
+      </w:r>
+      <w:r>
+        <w:rPr>
+          <w:lang w:val="es-ES"/>
+        </w:rPr>
+        <w:t xml:space="preserve"> </w:t>
       </w:r>
       <w:r>
         <w:t>Test Cases</w:t>
@@ -82,7 +88,7 @@
           <w:sz w:val="28"/>
           <w:lang w:val="es-ES"/>
         </w:rPr>
-        <w:t>1</w:t>
+        <w:t>2</w:t>
       </w:r>
       <w:r>
         <w:rPr>
@@ -396,6 +402,102 @@
           </w:p>
         </w:tc>
       </w:tr>
+      <w:tr>
+        <w:tc>
+          <w:tcPr>
+            <w:tcW w:w="2304" w:type="dxa"/>
+          </w:tcPr>
+          <w:p>
+            <w:pPr>
+              <w:pStyle w:val="Tabletext"/>
+              <w:rPr>
+                <w:lang w:val="es-ES"/>
+              </w:rPr>
+            </w:pPr>
+            <w:r>
+              <w:rPr>
+                <w:lang w:val="es-ES"/>
+              </w:rPr>
+              <w:t>17</w:t>
+            </w:r>
+            <w:r>
+              <w:rPr>
+                <w:lang w:val="es-ES"/>
+              </w:rPr>
+              <w:t>/0</w:t>
+            </w:r>
+            <w:r>
+              <w:rPr>
+                <w:lang w:val="es-ES"/>
+              </w:rPr>
+              <w:t>5</w:t>
+            </w:r>
+            <w:r>
+              <w:rPr>
+                <w:lang w:val="es-ES"/>
+              </w:rPr>
+              <w:t>/2026</w:t>
+            </w:r>
+          </w:p>
+        </w:tc>
+        <w:tc>
+          <w:tcPr>
+            <w:tcW w:w="1152" w:type="dxa"/>
+          </w:tcPr>
+          <w:p>
+            <w:pPr>
+              <w:pStyle w:val="Tabletext"/>
+              <w:rPr>
+                <w:lang w:val="es-ES"/>
+              </w:rPr>
+            </w:pPr>
+            <w:r>
+              <w:rPr>
+                <w:lang w:val="es-ES"/>
+              </w:rPr>
+              <w:t>1.2</w:t>
+            </w:r>
+          </w:p>
+        </w:tc>
+        <w:tc>
+          <w:tcPr>
+            <w:tcW w:w="3744" w:type="dxa"/>
+          </w:tcPr>
+          <w:p>
+            <w:pPr>
+              <w:pStyle w:val="Tabletext"/>
+              <w:rPr>
+                <w:lang w:val="es-ES"/>
+              </w:rPr>
+            </w:pPr>
+            <w:r>
+              <w:rPr>
+                <w:lang w:val="es-ES"/>
+              </w:rPr>
+              <w:t>Fixing details</w:t>
+            </w:r>
+          </w:p>
+        </w:tc>
+        <w:tc>
+          <w:tcPr>
+            <w:tcW w:w="2304" w:type="dxa"/>
+          </w:tcPr>
+          <w:p>
+            <w:pPr>
+              <w:pStyle w:val="Tabletext"/>
+              <w:rPr>
+                <w:lang w:val="es-ES"/>
+              </w:rPr>
+            </w:pPr>
+            <w:r>
+              <w:rPr>
+                <w:lang w:val="es-ES"/>
+              </w:rPr>
+              <w:t>Hugo Hernández</w:t>
+            </w:r>
+          </w:p>
+        </w:tc>
+      </w:tr>
     </w:tbl>
     <w:p>
       <w:pPr>
@@ -429,14 +531,16 @@
       <w:pPr>
         <w:pStyle w:val="TDC1"/>
         <w:tabs>
-          <w:tab w:val="left" w:pos="432"/>
+          <w:tab w:val="left" w:pos="864"/>
         </w:tabs>
         <w:rPr>
           <w:rFonts w:asciiTheme="minorHAnsi" w:eastAsiaTheme="minorEastAsia" w:hAnsiTheme="minorHAnsi" w:cstheme="minorBidi"/>
           <w:noProof/>
-          <w:sz w:val="22"/>
-          <w:szCs w:val="22"/>
-          <w:lang w:val="en-GB" w:eastAsia="en-GB"/>
+          <w:kern w:val="2"/>
+          <w:sz w:val="24"/>
+          <w:szCs w:val="24"/>
+          <w:lang w:val="es-ES" w:eastAsia="es-ES"/>
+          <w14:ligatures w14:val="standardContextual"/>
         </w:rPr>
       </w:pPr>
       <w:r>
@@ -462,7 +566,7 @@
       <w:r>
         <w:rPr>
           <w:noProof/>
-          <w:lang w:val="en-GB"/>
+          <w:lang w:val="es-ES"/>
         </w:rPr>
         <w:t>1.</w:t>
       </w:r>
@@ -470,16 +574,18 @@
         <w:rPr>
           <w:rFonts w:asciiTheme="minorHAnsi" w:eastAsiaTheme="minorEastAsia" w:hAnsiTheme="minorHAnsi" w:cstheme="minorBidi"/>
           <w:noProof/>
-          <w:sz w:val="22"/>
-          <w:szCs w:val="22"/>
-          <w:lang w:val="en-GB" w:eastAsia="en-GB"/>
+          <w:kern w:val="2"/>
+          <w:sz w:val="24"/>
+          <w:szCs w:val="24"/>
+          <w:lang w:val="es-ES" w:eastAsia="es-ES"/>
+          <w14:ligatures w14:val="standardContextual"/>
         </w:rPr>
         <w:tab/>
       </w:r>
       <w:r>
         <w:rPr>
           <w:noProof/>
-          <w:lang w:val="en-GB"/>
+          <w:lang w:val="es-ES"/>
         </w:rPr>
         <w:t>Test items</w:t>
       </w:r>
@@ -499,7 +605,7 @@
         <w:rPr>
           <w:noProof/>
         </w:rPr>
-        <w:instrText xml:space="preserve"> PAGEREF _Toc435546612 \h </w:instrText>
+        <w:instrText xml:space="preserve"> PAGEREF _Toc229937752 \h </w:instrText>
       </w:r>
       <w:r>
         <w:rPr>
@@ -529,20 +635,22 @@
       <w:pPr>
         <w:pStyle w:val="TDC1"/>
         <w:tabs>
-          <w:tab w:val="left" w:pos="432"/>
+          <w:tab w:val="left" w:pos="864"/>
         </w:tabs>
         <w:rPr>
           <w:rFonts w:asciiTheme="minorHAnsi" w:eastAsiaTheme="minorEastAsia" w:hAnsiTheme="minorHAnsi" w:cstheme="minorBidi"/>
           <w:noProof/>
-          <w:sz w:val="22"/>
-          <w:szCs w:val="22"/>
-          <w:lang w:val="en-GB" w:eastAsia="en-GB"/>
-        </w:rPr>
-      </w:pPr>
-      <w:r>
-        <w:rPr>
-          <w:noProof/>
-          <w:lang w:val="en-GB"/>
+          <w:kern w:val="2"/>
+          <w:sz w:val="24"/>
+          <w:szCs w:val="24"/>
+          <w:lang w:val="es-ES" w:eastAsia="es-ES"/>
+          <w14:ligatures w14:val="standardContextual"/>
+        </w:rPr>
+      </w:pPr>
+      <w:r>
+        <w:rPr>
+          <w:noProof/>
+          <w:lang w:val="es-ES"/>
         </w:rPr>
         <w:t>2.</w:t>
       </w:r>
@@ -550,16 +658,18 @@
         <w:rPr>
           <w:rFonts w:asciiTheme="minorHAnsi" w:eastAsiaTheme="minorEastAsia" w:hAnsiTheme="minorHAnsi" w:cstheme="minorBidi"/>
           <w:noProof/>
-          <w:sz w:val="22"/>
-          <w:szCs w:val="22"/>
-          <w:lang w:val="en-GB" w:eastAsia="en-GB"/>
+          <w:kern w:val="2"/>
+          <w:sz w:val="24"/>
+          <w:szCs w:val="24"/>
+          <w:lang w:val="es-ES" w:eastAsia="es-ES"/>
+          <w14:ligatures w14:val="standardContextual"/>
         </w:rPr>
         <w:tab/>
       </w:r>
       <w:r>
         <w:rPr>
           <w:noProof/>
-          <w:lang w:val="en-GB"/>
+          <w:lang w:val="es-ES"/>
         </w:rPr>
         <w:t>Input/Output Specification</w:t>
       </w:r>
@@ -579,7 +689,7 @@
         <w:rPr>
           <w:noProof/>
         </w:rPr>
-        <w:instrText xml:space="preserve"> PAGEREF _Toc435546613 \h </w:instrText>
+        <w:instrText xml:space="preserve"> PAGEREF _Toc229937753 \h </w:instrText>
       </w:r>
       <w:r>
         <w:rPr>
@@ -609,20 +719,22 @@
       <w:pPr>
         <w:pStyle w:val="TDC1"/>
         <w:tabs>
-          <w:tab w:val="left" w:pos="432"/>
+          <w:tab w:val="left" w:pos="864"/>
         </w:tabs>
         <w:rPr>
           <w:rFonts w:asciiTheme="minorHAnsi" w:eastAsiaTheme="minorEastAsia" w:hAnsiTheme="minorHAnsi" w:cstheme="minorBidi"/>
           <w:noProof/>
-          <w:sz w:val="22"/>
-          <w:szCs w:val="22"/>
-          <w:lang w:val="en-GB" w:eastAsia="en-GB"/>
-        </w:rPr>
-      </w:pPr>
-      <w:r>
-        <w:rPr>
-          <w:noProof/>
-          <w:lang w:val="en-GB"/>
+          <w:kern w:val="2"/>
+          <w:sz w:val="24"/>
+          <w:szCs w:val="24"/>
+          <w:lang w:val="es-ES" w:eastAsia="es-ES"/>
+          <w14:ligatures w14:val="standardContextual"/>
+        </w:rPr>
+      </w:pPr>
+      <w:r>
+        <w:rPr>
+          <w:noProof/>
+          <w:lang w:val="es-ES"/>
         </w:rPr>
         <w:t>3.</w:t>
       </w:r>
@@ -630,16 +742,18 @@
         <w:rPr>
           <w:rFonts w:asciiTheme="minorHAnsi" w:eastAsiaTheme="minorEastAsia" w:hAnsiTheme="minorHAnsi" w:cstheme="minorBidi"/>
           <w:noProof/>
-          <w:sz w:val="22"/>
-          <w:szCs w:val="22"/>
-          <w:lang w:val="en-GB" w:eastAsia="en-GB"/>
+          <w:kern w:val="2"/>
+          <w:sz w:val="24"/>
+          <w:szCs w:val="24"/>
+          <w:lang w:val="es-ES" w:eastAsia="es-ES"/>
+          <w14:ligatures w14:val="standardContextual"/>
         </w:rPr>
         <w:tab/>
       </w:r>
       <w:r>
         <w:rPr>
           <w:noProof/>
-          <w:lang w:val="en-GB"/>
+          <w:lang w:val="es-ES"/>
         </w:rPr>
         <w:t>Environmental needs</w:t>
       </w:r>
@@ -659,7 +773,7 @@
         <w:rPr>
           <w:noProof/>
         </w:rPr>
-        <w:instrText xml:space="preserve"> PAGEREF _Toc435546614 \h </w:instrText>
+        <w:instrText xml:space="preserve"> PAGEREF _Toc229937754 \h </w:instrText>
       </w:r>
       <w:r>
         <w:rPr>
@@ -676,7 +790,7 @@
         <w:rPr>
           <w:noProof/>
         </w:rPr>
-        <w:t>1</w:t>
+        <w:t>2</w:t>
       </w:r>
       <w:r>
         <w:rPr>
@@ -689,20 +803,22 @@
       <w:pPr>
         <w:pStyle w:val="TDC2"/>
         <w:tabs>
-          <w:tab w:val="left" w:pos="1100"/>
+          <w:tab w:val="left" w:pos="1200"/>
         </w:tabs>
         <w:rPr>
           <w:rFonts w:asciiTheme="minorHAnsi" w:eastAsiaTheme="minorEastAsia" w:hAnsiTheme="minorHAnsi" w:cstheme="minorBidi"/>
           <w:noProof/>
-          <w:sz w:val="22"/>
-          <w:szCs w:val="22"/>
-          <w:lang w:val="en-GB" w:eastAsia="en-GB"/>
-        </w:rPr>
-      </w:pPr>
-      <w:r>
-        <w:rPr>
-          <w:noProof/>
-          <w:lang w:val="en-GB"/>
+          <w:kern w:val="2"/>
+          <w:sz w:val="24"/>
+          <w:szCs w:val="24"/>
+          <w:lang w:val="es-ES" w:eastAsia="es-ES"/>
+          <w14:ligatures w14:val="standardContextual"/>
+        </w:rPr>
+      </w:pPr>
+      <w:r>
+        <w:rPr>
+          <w:noProof/>
+          <w:lang w:val="es-ES"/>
         </w:rPr>
         <w:t>3.1</w:t>
       </w:r>
@@ -710,16 +826,18 @@
         <w:rPr>
           <w:rFonts w:asciiTheme="minorHAnsi" w:eastAsiaTheme="minorEastAsia" w:hAnsiTheme="minorHAnsi" w:cstheme="minorBidi"/>
           <w:noProof/>
-          <w:sz w:val="22"/>
-          <w:szCs w:val="22"/>
-          <w:lang w:val="en-GB" w:eastAsia="en-GB"/>
+          <w:kern w:val="2"/>
+          <w:sz w:val="24"/>
+          <w:szCs w:val="24"/>
+          <w:lang w:val="es-ES" w:eastAsia="es-ES"/>
+          <w14:ligatures w14:val="standardContextual"/>
         </w:rPr>
         <w:tab/>
       </w:r>
       <w:r>
         <w:rPr>
           <w:noProof/>
-          <w:lang w:val="en-GB"/>
+          <w:lang w:val="es-ES"/>
         </w:rPr>
         <w:t>Hardware</w:t>
       </w:r>
@@ -739,7 +857,7 @@
         <w:rPr>
           <w:noProof/>
         </w:rPr>
-        <w:instrText xml:space="preserve"> PAGEREF _Toc435546615 \h </w:instrText>
+        <w:instrText xml:space="preserve"> PAGEREF _Toc229937755 \h </w:instrText>
       </w:r>
       <w:r>
         <w:rPr>
@@ -756,7 +874,7 @@
         <w:rPr>
           <w:noProof/>
         </w:rPr>
-        <w:t>1</w:t>
+        <w:t>2</w:t>
       </w:r>
       <w:r>
         <w:rPr>
@@ -769,20 +887,22 @@
       <w:pPr>
         <w:pStyle w:val="TDC2"/>
         <w:tabs>
-          <w:tab w:val="left" w:pos="1100"/>
+          <w:tab w:val="left" w:pos="1200"/>
         </w:tabs>
         <w:rPr>
           <w:rFonts w:asciiTheme="minorHAnsi" w:eastAsiaTheme="minorEastAsia" w:hAnsiTheme="minorHAnsi" w:cstheme="minorBidi"/>
           <w:noProof/>
-          <w:sz w:val="22"/>
-          <w:szCs w:val="22"/>
-          <w:lang w:val="en-GB" w:eastAsia="en-GB"/>
-        </w:rPr>
-      </w:pPr>
-      <w:r>
-        <w:rPr>
-          <w:noProof/>
-          <w:lang w:val="en-GB"/>
+          <w:kern w:val="2"/>
+          <w:sz w:val="24"/>
+          <w:szCs w:val="24"/>
+          <w:lang w:val="es-ES" w:eastAsia="es-ES"/>
+          <w14:ligatures w14:val="standardContextual"/>
+        </w:rPr>
+      </w:pPr>
+      <w:r>
+        <w:rPr>
+          <w:noProof/>
+          <w:lang w:val="es-ES"/>
         </w:rPr>
         <w:t>3.2</w:t>
       </w:r>
@@ -790,16 +910,18 @@
         <w:rPr>
           <w:rFonts w:asciiTheme="minorHAnsi" w:eastAsiaTheme="minorEastAsia" w:hAnsiTheme="minorHAnsi" w:cstheme="minorBidi"/>
           <w:noProof/>
-          <w:sz w:val="22"/>
-          <w:szCs w:val="22"/>
-          <w:lang w:val="en-GB" w:eastAsia="en-GB"/>
+          <w:kern w:val="2"/>
+          <w:sz w:val="24"/>
+          <w:szCs w:val="24"/>
+          <w:lang w:val="es-ES" w:eastAsia="es-ES"/>
+          <w14:ligatures w14:val="standardContextual"/>
         </w:rPr>
         <w:tab/>
       </w:r>
       <w:r>
         <w:rPr>
           <w:noProof/>
-          <w:lang w:val="en-GB"/>
+          <w:lang w:val="es-ES"/>
         </w:rPr>
         <w:t>Software</w:t>
       </w:r>
@@ -819,7 +941,7 @@
         <w:rPr>
           <w:noProof/>
         </w:rPr>
-        <w:instrText xml:space="preserve"> PAGEREF _Toc435546616 \h </w:instrText>
+        <w:instrText xml:space="preserve"> PAGEREF _Toc229937756 \h </w:instrText>
       </w:r>
       <w:r>
         <w:rPr>
@@ -836,7 +958,7 @@
         <w:rPr>
           <w:noProof/>
         </w:rPr>
-        <w:t>1</w:t>
+        <w:t>2</w:t>
       </w:r>
       <w:r>
         <w:rPr>
@@ -849,20 +971,22 @@
       <w:pPr>
         <w:pStyle w:val="TDC2"/>
         <w:tabs>
-          <w:tab w:val="left" w:pos="1100"/>
+          <w:tab w:val="left" w:pos="1200"/>
         </w:tabs>
         <w:rPr>
           <w:rFonts w:asciiTheme="minorHAnsi" w:eastAsiaTheme="minorEastAsia" w:hAnsiTheme="minorHAnsi" w:cstheme="minorBidi"/>
           <w:noProof/>
-          <w:sz w:val="22"/>
-          <w:szCs w:val="22"/>
-          <w:lang w:val="en-GB" w:eastAsia="en-GB"/>
-        </w:rPr>
-      </w:pPr>
-      <w:r>
-        <w:rPr>
-          <w:noProof/>
-          <w:lang w:val="en-GB"/>
+          <w:kern w:val="2"/>
+          <w:sz w:val="24"/>
+          <w:szCs w:val="24"/>
+          <w:lang w:val="es-ES" w:eastAsia="es-ES"/>
+          <w14:ligatures w14:val="standardContextual"/>
+        </w:rPr>
+      </w:pPr>
+      <w:r>
+        <w:rPr>
+          <w:noProof/>
+          <w:lang w:val="es-ES"/>
         </w:rPr>
         <w:t>3.3</w:t>
       </w:r>
@@ -870,16 +994,18 @@
         <w:rPr>
           <w:rFonts w:asciiTheme="minorHAnsi" w:eastAsiaTheme="minorEastAsia" w:hAnsiTheme="minorHAnsi" w:cstheme="minorBidi"/>
           <w:noProof/>
-          <w:sz w:val="22"/>
-          <w:szCs w:val="22"/>
-          <w:lang w:val="en-GB" w:eastAsia="en-GB"/>
+          <w:kern w:val="2"/>
+          <w:sz w:val="24"/>
+          <w:szCs w:val="24"/>
+          <w:lang w:val="es-ES" w:eastAsia="es-ES"/>
+          <w14:ligatures w14:val="standardContextual"/>
         </w:rPr>
         <w:tab/>
       </w:r>
       <w:r>
         <w:rPr>
           <w:noProof/>
-          <w:lang w:val="en-GB"/>
+          <w:lang w:val="es-ES"/>
         </w:rPr>
         <w:t>Otros</w:t>
       </w:r>
@@ -899,7 +1025,7 @@
         <w:rPr>
           <w:noProof/>
         </w:rPr>
-        <w:instrText xml:space="preserve"> PAGEREF _Toc435546617 \h </w:instrText>
+        <w:instrText xml:space="preserve"> PAGEREF _Toc229937757 \h </w:instrText>
       </w:r>
       <w:r>
         <w:rPr>
@@ -916,7 +1042,7 @@
         <w:rPr>
           <w:noProof/>
         </w:rPr>
-        <w:t>1</w:t>
+        <w:t>2</w:t>
       </w:r>
       <w:r>
         <w:rPr>
@@ -929,20 +1055,22 @@
       <w:pPr>
         <w:pStyle w:val="TDC1"/>
         <w:tabs>
-          <w:tab w:val="left" w:pos="432"/>
+          <w:tab w:val="left" w:pos="864"/>
         </w:tabs>
         <w:rPr>
           <w:rFonts w:asciiTheme="minorHAnsi" w:eastAsiaTheme="minorEastAsia" w:hAnsiTheme="minorHAnsi" w:cstheme="minorBidi"/>
           <w:noProof/>
-          <w:sz w:val="22"/>
-          <w:szCs w:val="22"/>
-          <w:lang w:val="en-GB" w:eastAsia="en-GB"/>
-        </w:rPr>
-      </w:pPr>
-      <w:r>
-        <w:rPr>
-          <w:noProof/>
-          <w:lang w:val="en-GB"/>
+          <w:kern w:val="2"/>
+          <w:sz w:val="24"/>
+          <w:szCs w:val="24"/>
+          <w:lang w:val="es-ES" w:eastAsia="es-ES"/>
+          <w14:ligatures w14:val="standardContextual"/>
+        </w:rPr>
+      </w:pPr>
+      <w:r>
+        <w:rPr>
+          <w:noProof/>
+          <w:lang w:val="es-ES"/>
         </w:rPr>
         <w:t>4.</w:t>
       </w:r>
@@ -950,16 +1078,18 @@
         <w:rPr>
           <w:rFonts w:asciiTheme="minorHAnsi" w:eastAsiaTheme="minorEastAsia" w:hAnsiTheme="minorHAnsi" w:cstheme="minorBidi"/>
           <w:noProof/>
-          <w:sz w:val="22"/>
-          <w:szCs w:val="22"/>
-          <w:lang w:val="en-GB" w:eastAsia="en-GB"/>
+          <w:kern w:val="2"/>
+          <w:sz w:val="24"/>
+          <w:szCs w:val="24"/>
+          <w:lang w:val="es-ES" w:eastAsia="es-ES"/>
+          <w14:ligatures w14:val="standardContextual"/>
         </w:rPr>
         <w:tab/>
       </w:r>
       <w:r>
         <w:rPr>
           <w:noProof/>
-          <w:lang w:val="en-GB"/>
+          <w:lang w:val="es-ES"/>
         </w:rPr>
         <w:t>Special procedural requirements</w:t>
       </w:r>
@@ -979,7 +1109,7 @@
         <w:rPr>
           <w:noProof/>
         </w:rPr>
-        <w:instrText xml:space="preserve"> PAGEREF _Toc435546618 \h </w:instrText>
+        <w:instrText xml:space="preserve"> PAGEREF _Toc229937758 \h </w:instrText>
       </w:r>
       <w:r>
         <w:rPr>
@@ -1009,20 +1139,22 @@
       <w:pPr>
         <w:pStyle w:val="TDC1"/>
         <w:tabs>
-          <w:tab w:val="left" w:pos="432"/>
+          <w:tab w:val="left" w:pos="864"/>
         </w:tabs>
         <w:rPr>
           <w:rFonts w:asciiTheme="minorHAnsi" w:eastAsiaTheme="minorEastAsia" w:hAnsiTheme="minorHAnsi" w:cstheme="minorBidi"/>
           <w:noProof/>
-          <w:sz w:val="22"/>
-          <w:szCs w:val="22"/>
-          <w:lang w:val="en-GB" w:eastAsia="en-GB"/>
-        </w:rPr>
-      </w:pPr>
-      <w:r>
-        <w:rPr>
-          <w:noProof/>
-          <w:lang w:val="en-GB"/>
+          <w:kern w:val="2"/>
+          <w:sz w:val="24"/>
+          <w:szCs w:val="24"/>
+          <w:lang w:val="es-ES" w:eastAsia="es-ES"/>
+          <w14:ligatures w14:val="standardContextual"/>
+        </w:rPr>
+      </w:pPr>
+      <w:r>
+        <w:rPr>
+          <w:noProof/>
+          <w:lang w:val="es-ES"/>
         </w:rPr>
         <w:t>5.</w:t>
       </w:r>
@@ -1030,16 +1162,18 @@
         <w:rPr>
           <w:rFonts w:asciiTheme="minorHAnsi" w:eastAsiaTheme="minorEastAsia" w:hAnsiTheme="minorHAnsi" w:cstheme="minorBidi"/>
           <w:noProof/>
-          <w:sz w:val="22"/>
-          <w:szCs w:val="22"/>
-          <w:lang w:val="en-GB" w:eastAsia="en-GB"/>
+          <w:kern w:val="2"/>
+          <w:sz w:val="24"/>
+          <w:szCs w:val="24"/>
+          <w:lang w:val="es-ES" w:eastAsia="es-ES"/>
+          <w14:ligatures w14:val="standardContextual"/>
         </w:rPr>
         <w:tab/>
       </w:r>
       <w:r>
         <w:rPr>
           <w:noProof/>
-          <w:lang w:val="en-GB"/>
+          <w:lang w:val="es-ES"/>
         </w:rPr>
         <w:t>Intercase dependencies</w:t>
       </w:r>
@@ -1059,7 +1193,7 @@
         <w:rPr>
           <w:noProof/>
         </w:rPr>
-        <w:instrText xml:space="preserve"> PAGEREF _Toc435546619 \h </w:instrText>
+        <w:instrText xml:space="preserve"> PAGEREF _Toc229937759 \h </w:instrText>
       </w:r>
       <w:r>
         <w:rPr>
@@ -1125,22 +1259,21 @@
           <w:lang w:val="es-ES"/>
         </w:rPr>
       </w:pPr>
-      <w:bookmarkStart w:id="0" w:name="_Toc435546612"/>
-      <w:bookmarkStart w:id="1" w:name="_Toc436203377"/>
-      <w:bookmarkStart w:id="2" w:name="_Toc452813577"/>
+      <w:bookmarkStart w:id="0" w:name="_Toc436203377"/>
+      <w:bookmarkStart w:id="1" w:name="_Toc452813577"/>
+      <w:bookmarkStart w:id="2" w:name="_Toc229937752"/>
       <w:r>
         <w:rPr>
           <w:lang w:val="es-ES"/>
         </w:rPr>
         <w:t>Test items</w:t>
       </w:r>
-      <w:bookmarkEnd w:id="0"/>
+      <w:bookmarkEnd w:id="2"/>
     </w:p>
     <w:p>
       <w:pPr>
         <w:ind w:left="708"/>
       </w:pPr>
-      <w:bookmarkStart w:id="3" w:name="_Toc435546613"/>
       <w:r>
         <w:t>AppFor</w:t>
       </w:r>
@@ -1167,6 +1300,7 @@
           <w:lang w:val="es-ES"/>
         </w:rPr>
       </w:pPr>
+      <w:bookmarkStart w:id="3" w:name="_Toc229937753"/>
       <w:r>
         <w:rPr>
           <w:lang w:val="es-ES"/>
@@ -1550,13 +1684,13 @@
         <w:tblLook w:val="04A0" w:firstRow="1" w:lastRow="0" w:firstColumn="1" w:lastColumn="0" w:noHBand="0" w:noVBand="1"/>
       </w:tblPr>
       <w:tblGrid>
-        <w:gridCol w:w="2220"/>
-        <w:gridCol w:w="1730"/>
-        <w:gridCol w:w="1869"/>
-        <w:gridCol w:w="1332"/>
-        <w:gridCol w:w="1430"/>
+        <w:gridCol w:w="2202"/>
+        <w:gridCol w:w="1733"/>
+        <w:gridCol w:w="1875"/>
+        <w:gridCol w:w="1334"/>
+        <w:gridCol w:w="1432"/>
         <w:gridCol w:w="3879"/>
-        <w:gridCol w:w="2567"/>
+        <w:gridCol w:w="2572"/>
       </w:tblGrid>
       <w:tr>
         <w:tc>
@@ -3620,7 +3754,7 @@
                 <w:rFonts w:asciiTheme="minorHAnsi" w:hAnsiTheme="minorHAnsi" w:cstheme="minorHAnsi"/>
                 <w:lang w:val="es-ES"/>
               </w:rPr>
-              <w:t>_5</w:t>
+              <w:t>_</w:t>
             </w:r>
             <w:r>
               <w:rPr>
@@ -3866,7 +4000,7 @@
           <w:lang w:val="es-ES"/>
         </w:rPr>
       </w:pPr>
-      <w:bookmarkStart w:id="4" w:name="_Toc435546614"/>
+      <w:bookmarkStart w:id="4" w:name="_Toc229937754"/>
       <w:r>
         <w:rPr>
           <w:lang w:val="es-ES"/>
@@ -3882,7 +4016,7 @@
           <w:lang w:val="es-ES"/>
         </w:rPr>
       </w:pPr>
-      <w:bookmarkStart w:id="5" w:name="_Toc435546615"/>
+      <w:bookmarkStart w:id="5" w:name="_Toc229937755"/>
       <w:r>
         <w:rPr>
           <w:lang w:val="es-ES"/>
@@ -3902,7 +4036,6 @@
           <w:lang w:val="es-ES"/>
         </w:rPr>
       </w:pPr>
-      <w:bookmarkStart w:id="6" w:name="_Toc435546616"/>
       <w:r>
         <w:rPr>
           <w:rFonts w:cstheme="minorHAnsi"/>
@@ -3919,6 +4052,7 @@
           <w:lang w:val="es-ES"/>
         </w:rPr>
       </w:pPr>
+      <w:bookmarkStart w:id="6" w:name="_Toc229937756"/>
       <w:r>
         <w:rPr>
           <w:lang w:val="es-ES"/>
@@ -3963,7 +4097,7 @@
           <w:lang w:val="es-ES"/>
         </w:rPr>
       </w:pPr>
-      <w:bookmarkStart w:id="7" w:name="_Toc435546617"/>
+      <w:bookmarkStart w:id="7" w:name="_Toc229937757"/>
       <w:r>
         <w:rPr>
           <w:lang w:val="es-ES"/>
@@ -4001,7 +4135,7 @@
           <w:lang w:val="es-ES"/>
         </w:rPr>
       </w:pPr>
-      <w:bookmarkStart w:id="8" w:name="_Toc435546618"/>
+      <w:bookmarkStart w:id="8" w:name="_Toc229937758"/>
       <w:r>
         <w:rPr>
           <w:lang w:val="es-ES"/>
@@ -4290,7 +4424,7 @@
           <w:lang w:val="es-ES"/>
         </w:rPr>
       </w:pPr>
-      <w:bookmarkStart w:id="9" w:name="_Toc435546619"/>
+      <w:bookmarkStart w:id="9" w:name="_Toc229937759"/>
       <w:r>
         <w:rPr>
           <w:lang w:val="es-ES"/>
@@ -4299,8 +4433,8 @@
       </w:r>
       <w:bookmarkEnd w:id="9"/>
     </w:p>
+    <w:bookmarkEnd w:id="0"/>
     <w:bookmarkEnd w:id="1"/>
-    <w:bookmarkEnd w:id="2"/>
     <w:p>
       <w:pPr>
         <w:ind w:left="708"/>
@@ -4422,7 +4556,10 @@
             </w:r>
           </w:fldSimple>
           <w:r>
-            <w:t>, 2000</w:t>
+            <w:t>, 20</w:t>
+          </w:r>
+          <w:r>
+            <w:t>26</w:t>
           </w:r>
         </w:p>
       </w:tc>
@@ -4638,7 +4775,7 @@
             <w:t xml:space="preserve">  Version:           &lt;1.</w:t>
           </w:r>
           <w:r>
-            <w:t>1</w:t>
+            <w:t>2</w:t>
           </w:r>
           <w:r>
             <w:t>&gt;</w:t>
@@ -4666,13 +4803,16 @@
             <w:t xml:space="preserve">  Fecha:  &lt;</w:t>
           </w:r>
           <w:r>
-            <w:t>01</w:t>
+            <w:t>17</w:t>
           </w:r>
           <w:r>
             <w:t>/</w:t>
           </w:r>
           <w:r>
-            <w:t>03</w:t>
+            <w:t>0</w:t>
+          </w:r>
+          <w:r>
+            <w:t>5</w:t>
           </w:r>
           <w:r>
             <w:t>/</w:t>
@@ -6278,6 +6418,7 @@
   <w:style w:type="character" w:default="1" w:styleId="Fuentedeprrafopredeter">
     <w:name w:val="Default Paragraph Font"/>
     <w:uiPriority w:val="1"/>
+    <w:semiHidden/>
     <w:unhideWhenUsed/>
   </w:style>
   <w:style w:type="table" w:default="1" w:styleId="Tablanormal">

</xml_diff>